<commit_message>
Modificacion de varios modulos
</commit_message>
<xml_diff>
--- a/Gestion de Alquiler y Reservaciones/Plantillas/CONTRATO APARTAMENTOS.docx
+++ b/Gestion de Alquiler y Reservaciones/Plantillas/CONTRATO APARTAMENTOS.docx
@@ -175,7 +175,15 @@
         <w:t xml:space="preserve">y por otro lado el Señor </w:t>
       </w:r>
       <w:r>
-        <w:t>${nombre_arrendatario}</w:t>
+        <w:t>${</w:t>
+      </w:r>
+      <w:proofErr w:type="spellStart"/>
+      <w:r>
+        <w:t>nombre_arrendatario</w:t>
+      </w:r>
+      <w:proofErr w:type="spellEnd"/>
+      <w:r>
+        <w:t>}</w:t>
       </w:r>
       <w:r>
         <w:t xml:space="preserve"> mayor de edad, hondureño y de este domicilio, con identidad </w:t>
@@ -184,7 +192,15 @@
         <w:t xml:space="preserve">No </w:t>
       </w:r>
       <w:r>
-        <w:t>${identidad_arrendatario}</w:t>
+        <w:t>${</w:t>
+      </w:r>
+      <w:proofErr w:type="spellStart"/>
+      <w:r>
+        <w:t>identidad_arrendatario</w:t>
+      </w:r>
+      <w:proofErr w:type="spellEnd"/>
+      <w:r>
+        <w:t>}</w:t>
       </w:r>
       <w:r>
         <w:t>,</w:t>
@@ -627,6 +643,7 @@
         </w:rPr>
         <w:t>{</w:t>
       </w:r>
+      <w:proofErr w:type="spellStart"/>
       <w:r>
         <w:rPr>
           <w:b/>
@@ -634,6 +651,7 @@
         </w:rPr>
         <w:t>numero_departamento</w:t>
       </w:r>
+      <w:proofErr w:type="spellEnd"/>
       <w:r>
         <w:rPr>
           <w:b/>
@@ -672,8 +690,13 @@
         <w:t xml:space="preserve"> </w:t>
       </w:r>
       <w:r>
-        <w:t>cuadrados, que consta de: puerta principal de acceso de madera, sala, comedor y cocina con un extractor de calor, mueble de madera con sus gabinetes, lavador y desayunador de granito, 2 habitaciones con su respectivo baño completo, con ducha eléctrica y closet de madera, climatizadas con aires de 12,000 BTU cada una, marca Confortstar</w:t>
-      </w:r>
+        <w:t xml:space="preserve">cuadrados, que consta de: puerta principal de acceso de madera, sala, comedor y cocina con un extractor de calor, mueble de madera con sus gabinetes, lavador y desayunador de granito, 2 habitaciones con su respectivo baño completo, con ducha eléctrica y closet de madera, climatizadas con aires de 12,000 BTU cada una, marca </w:t>
+      </w:r>
+      <w:proofErr w:type="spellStart"/>
+      <w:r>
+        <w:t>Confortstar</w:t>
+      </w:r>
+      <w:proofErr w:type="spellEnd"/>
       <w:r>
         <w:rPr>
           <w:b/>
@@ -684,7 +707,15 @@
         <w:t xml:space="preserve">un panel eléctrico de 8 circuitos, dicho departamento cuenta con un medidor de energía eléctrica CLAVE PRIMARIA: </w:t>
       </w:r>
       <w:r>
-        <w:t>${clave_contador}</w:t>
+        <w:t>${</w:t>
+      </w:r>
+      <w:proofErr w:type="spellStart"/>
+      <w:r>
+        <w:t>clave_contador</w:t>
+      </w:r>
+      <w:proofErr w:type="spellEnd"/>
+      <w:r>
+        <w:t>}</w:t>
       </w:r>
       <w:r>
         <w:t>.</w:t>
@@ -927,6 +958,7 @@
         </w:rPr>
         <w:t>{</w:t>
       </w:r>
+      <w:proofErr w:type="spellStart"/>
       <w:r>
         <w:rPr>
           <w:b/>
@@ -939,14 +971,54 @@
           <w:b/>
           <w:bCs/>
         </w:rPr>
-        <w:t>_arrendamiento}</w:t>
-      </w:r>
+        <w:t>_arrendamiento</w:t>
+      </w:r>
+      <w:proofErr w:type="spellEnd"/>
       <w:r>
         <w:rPr>
           <w:b/>
           <w:bCs/>
         </w:rPr>
-        <w:t xml:space="preserve"> DE ${mes_arrendamiento} DEL {anio_arrendamiento}</w:t>
+        <w:t>}</w:t>
+      </w:r>
+      <w:r>
+        <w:rPr>
+          <w:b/>
+          <w:bCs/>
+        </w:rPr>
+        <w:t xml:space="preserve"> DE ${</w:t>
+      </w:r>
+      <w:proofErr w:type="spellStart"/>
+      <w:r>
+        <w:rPr>
+          <w:b/>
+          <w:bCs/>
+        </w:rPr>
+        <w:t>mes_arrendamiento</w:t>
+      </w:r>
+      <w:proofErr w:type="spellEnd"/>
+      <w:r>
+        <w:rPr>
+          <w:b/>
+          <w:bCs/>
+        </w:rPr>
+        <w:t>} DEL {</w:t>
+      </w:r>
+      <w:proofErr w:type="spellStart"/>
+      <w:r>
+        <w:rPr>
+          <w:b/>
+          <w:bCs/>
+        </w:rPr>
+        <w:t>anio_arrendamiento</w:t>
+      </w:r>
+      <w:proofErr w:type="spellEnd"/>
+      <w:r>
+        <w:rPr>
+          <w:b/>
+          <w:bCs/>
+        </w:rPr>
+        <w:t>}</w:t>
       </w:r>
       <w:r>
         <w:rPr>
@@ -1271,9 +1343,11 @@
         </w:rPr>
         <w:t xml:space="preserve"> </w:t>
       </w:r>
+      <w:proofErr w:type="gramStart"/>
       <w:r>
         <w:t>anticipación.-</w:t>
       </w:r>
+      <w:proofErr w:type="gramEnd"/>
       <w:r>
         <w:rPr>
           <w:spacing w:val="-14"/>
@@ -1655,7 +1729,21 @@
         <w:rPr>
           <w:b/>
         </w:rPr>
-        <w:t>${precio_letras}</w:t>
+        <w:t>${</w:t>
+      </w:r>
+      <w:proofErr w:type="spellStart"/>
+      <w:r>
+        <w:rPr>
+          <w:b/>
+        </w:rPr>
+        <w:t>precio_letras</w:t>
+      </w:r>
+      <w:proofErr w:type="spellEnd"/>
+      <w:r>
+        <w:rPr>
+          <w:b/>
+        </w:rPr>
+        <w:t>}</w:t>
       </w:r>
       <w:r>
         <w:rPr>
@@ -1667,7 +1755,21 @@
         <w:rPr>
           <w:b/>
         </w:rPr>
-        <w:t>${precio_unitario}</w:t>
+        <w:t>${</w:t>
+      </w:r>
+      <w:proofErr w:type="spellStart"/>
+      <w:r>
+        <w:rPr>
+          <w:b/>
+        </w:rPr>
+        <w:t>precio_unitario</w:t>
+      </w:r>
+      <w:proofErr w:type="spellEnd"/>
+      <w:r>
+        <w:rPr>
+          <w:b/>
+        </w:rPr>
+        <w:t>}</w:t>
       </w:r>
       <w:r>
         <w:rPr>
@@ -1683,15 +1785,24 @@
           <w:b/>
           <w:bCs/>
         </w:rPr>
-        <w:t>${dia</w:t>
-      </w:r>
+        <w:t>${</w:t>
+      </w:r>
+      <w:proofErr w:type="spellStart"/>
       <w:r>
         <w:rPr>
           <w:b/>
           <w:bCs/>
         </w:rPr>
+        <w:t>dia</w:t>
+      </w:r>
+      <w:r>
+        <w:rPr>
+          <w:b/>
+          <w:bCs/>
+        </w:rPr>
         <w:t>_mensualidad</w:t>
       </w:r>
+      <w:proofErr w:type="spellEnd"/>
       <w:r>
         <w:rPr>
           <w:b/>
@@ -3601,7 +3712,15 @@
         <w:t>$</w:t>
       </w:r>
       <w:r>
-        <w:t>{deposito_letras}</w:t>
+        <w:t>{</w:t>
+      </w:r>
+      <w:proofErr w:type="spellStart"/>
+      <w:r>
+        <w:t>deposito_letras</w:t>
+      </w:r>
+      <w:proofErr w:type="spellEnd"/>
+      <w:r>
+        <w:t>}</w:t>
       </w:r>
       <w:r>
         <w:rPr>
@@ -3619,10 +3738,26 @@
         <w:t xml:space="preserve"> </w:t>
       </w:r>
       <w:r>
-        <w:t>(Lps.</w:t>
-      </w:r>
-      <w:r>
-        <w:t xml:space="preserve"> ${deposito_unitario}</w:t>
+        <w:t>(</w:t>
+      </w:r>
+      <w:proofErr w:type="spellStart"/>
+      <w:r>
+        <w:t>Lps</w:t>
+      </w:r>
+      <w:proofErr w:type="spellEnd"/>
+      <w:r>
+        <w:t>.</w:t>
+      </w:r>
+      <w:r>
+        <w:t xml:space="preserve"> ${</w:t>
+      </w:r>
+      <w:proofErr w:type="spellStart"/>
+      <w:r>
+        <w:t>deposito_unitario</w:t>
+      </w:r>
+      <w:proofErr w:type="spellEnd"/>
+      <w:r>
+        <w:t>}</w:t>
       </w:r>
       <w:r>
         <w:t>)</w:t>
@@ -3813,7 +3948,36 @@
         <w:rPr>
           <w:b/>
         </w:rPr>
-        <w:t xml:space="preserve">QUINTO: EL SR. XXXX </w:t>
+        <w:t xml:space="preserve">QUINTO: EL SR. </w:t>
+      </w:r>
+      <w:r>
+        <w:rPr>
+          <w:b/>
+          <w:bCs/>
+        </w:rPr>
+        <w:t>${</w:t>
+      </w:r>
+      <w:proofErr w:type="spellStart"/>
+      <w:r>
+        <w:rPr>
+          <w:b/>
+          <w:bCs/>
+        </w:rPr>
+        <w:t>nombre_arrendatario</w:t>
+      </w:r>
+      <w:proofErr w:type="spellEnd"/>
+      <w:r>
+        <w:rPr>
+          <w:b/>
+          <w:bCs/>
+        </w:rPr>
+        <w:t>}</w:t>
+      </w:r>
+      <w:r>
+        <w:rPr>
+          <w:b/>
+        </w:rPr>
+        <w:t xml:space="preserve"> </w:t>
       </w:r>
       <w:r>
         <w:t>en su condición de ARRENDATARIO dice que es cierto todo lo expresado en las cláusulas anteriores, por lo cual ratifica y acepta este contrato de arrendamiento,</w:t>
@@ -3944,12 +4108,14 @@
         </w:rPr>
         <w:t>{</w:t>
       </w:r>
+      <w:proofErr w:type="spellStart"/>
       <w:r>
         <w:rPr>
           <w:lang w:val="es-HN"/>
         </w:rPr>
         <w:t>dia_actual</w:t>
       </w:r>
+      <w:proofErr w:type="spellEnd"/>
       <w:r>
         <w:rPr>
           <w:lang w:val="es-HN"/>
@@ -3960,12 +4126,26 @@
         <w:rPr>
           <w:lang w:val="es-HN"/>
         </w:rPr>
-        <w:t xml:space="preserve"> del mes ${mes_actual} del a</w:t>
-      </w:r>
+        <w:t xml:space="preserve"> del mes ${</w:t>
+      </w:r>
+      <w:proofErr w:type="spellStart"/>
       <w:r>
         <w:rPr>
           <w:lang w:val="es-HN"/>
         </w:rPr>
+        <w:t>mes_actual</w:t>
+      </w:r>
+      <w:proofErr w:type="spellEnd"/>
+      <w:r>
+        <w:rPr>
+          <w:lang w:val="es-HN"/>
+        </w:rPr>
+        <w:t>} del a</w:t>
+      </w:r>
+      <w:r>
+        <w:rPr>
+          <w:lang w:val="es-HN"/>
+        </w:rPr>
         <w:t>ñ</w:t>
       </w:r>
       <w:r>
@@ -3980,11 +4160,19 @@
         </w:rPr>
         <w:t>{</w:t>
       </w:r>
+      <w:proofErr w:type="spellStart"/>
       <w:r>
         <w:rPr>
           <w:lang w:val="es-HN"/>
         </w:rPr>
-        <w:t>anio_actual}</w:t>
+        <w:t>anio_actual</w:t>
+      </w:r>
+      <w:proofErr w:type="spellEnd"/>
+      <w:r>
+        <w:rPr>
+          <w:lang w:val="es-HN"/>
+        </w:rPr>
+        <w:t>}</w:t>
       </w:r>
       <w:r>
         <w:t>.</w:t>
@@ -4142,7 +4330,7 @@
           </mc:Choice>
           <mc:Fallback>
             <w:pict>
-              <v:shape w14:anchorId="787582EF" id="Graphic 1" o:spid="_x0000_s1026" style="position:absolute;margin-left:112pt;margin-top:18.4pt;width:165pt;height:.1pt;z-index:-15728640;visibility:visible;mso-wrap-style:square;mso-wrap-distance-left:0;mso-wrap-distance-top:0;mso-wrap-distance-right:0;mso-wrap-distance-bottom:0;mso-position-horizontal:absolute;mso-position-horizontal-relative:page;mso-position-vertical:absolute;mso-position-vertical-relative:text;v-text-anchor:top" coordsize="2095500,1270" o:gfxdata="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" path="m,l2095408,e" filled="f" strokeweight=".15808mm">
+              <v:shape w14:anchorId="1676982F" id="Graphic 1" o:spid="_x0000_s1026" style="position:absolute;margin-left:112pt;margin-top:18.4pt;width:165pt;height:.1pt;z-index:-15728640;visibility:visible;mso-wrap-style:square;mso-wrap-distance-left:0;mso-wrap-distance-top:0;mso-wrap-distance-right:0;mso-wrap-distance-bottom:0;mso-position-horizontal:absolute;mso-position-horizontal-relative:page;mso-position-vertical:absolute;mso-position-vertical-relative:text;v-text-anchor:top" coordsize="2095500,1270" o:gfxdata="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" path="m,l2095408,e" filled="f" strokeweight=".15808mm">
                 <v:path arrowok="t"/>
                 <w10:wrap type="topAndBottom" anchorx="page"/>
               </v:shape>
@@ -4222,7 +4410,7 @@
           </mc:Choice>
           <mc:Fallback>
             <w:pict>
-              <v:shape w14:anchorId="3487DEC7" id="Graphic 2" o:spid="_x0000_s1026" style="position:absolute;margin-left:332.95pt;margin-top:18.4pt;width:154.1pt;height:.1pt;z-index:-15728128;visibility:visible;mso-wrap-style:square;mso-wrap-distance-left:0;mso-wrap-distance-top:0;mso-wrap-distance-right:0;mso-wrap-distance-bottom:0;mso-position-horizontal:absolute;mso-position-horizontal-relative:page;mso-position-vertical:absolute;mso-position-vertical-relative:text;v-text-anchor:top" coordsize="1957070,1270" o:gfxdata="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" path="m,l1956743,e" filled="f" strokeweight=".15808mm">
+              <v:shape w14:anchorId="4D6B9656" id="Graphic 2" o:spid="_x0000_s1026" style="position:absolute;margin-left:332.95pt;margin-top:18.4pt;width:154.1pt;height:.1pt;z-index:-15728128;visibility:visible;mso-wrap-style:square;mso-wrap-distance-left:0;mso-wrap-distance-top:0;mso-wrap-distance-right:0;mso-wrap-distance-bottom:0;mso-position-horizontal:absolute;mso-position-horizontal-relative:page;mso-position-vertical:absolute;mso-position-vertical-relative:text;v-text-anchor:top" coordsize="1957070,1270" o:gfxdata="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" path="m,l1956743,e" filled="f" strokeweight=".15808mm">
                 <v:path arrowok="t"/>
                 <w10:wrap type="topAndBottom" anchorx="page"/>
               </v:shape>

</xml_diff>